<commit_message>
Tester brief: document the Enhanced Safe Browsing dialog
Newly-approved Chrome extensions trigger a 'Proceed with caution -
not trusted by Enhanced Safe Browsing' dialog on install. The warning
is purely about install-history age, not about anything wrong with
the extension. Several beta testers will likely hit this and not
know what to do. Brief now explains that this is expected and to
click 'Continue to install'.
</commit_message>
<xml_diff>
--- a/beta/tester-brief.docx
+++ b/beta/tester-brief.docx
@@ -7,7 +7,7 @@
         <w:pStyle w:val="Title"/>
       </w:pPr>
       <w:r>
-        <w:t>AMASAMYA Beta — Tester Brief</w:t>
+        <w:t>AMASAMYA — Tester Brief</w:t>
       </w:r>
     </w:p>
     <w:p>
@@ -270,6 +270,68 @@
     <w:p>
       <w:r>
         <w:t>instead of (or in addition to) compensation, tell us in the form.</w:t>
+      </w:r>
+    </w:p>
+    <w:p>
+      <w:pPr>
+        <w:pStyle w:val="Heading2"/>
+      </w:pPr>
+      <w:r>
+        <w:t>Installing the Chrome extension (if your test path uses it)</w:t>
+      </w:r>
+    </w:p>
+    <w:p>
+      <w:r>
+        <w:t>When you install AMASAMYA from the Chrome Web Store, Chrome may show a</w:t>
+      </w:r>
+    </w:p>
+    <w:p>
+      <w:r>
+        <w:t>dialog titled "Proceed with caution" that says the extension is not</w:t>
+      </w:r>
+    </w:p>
+    <w:p>
+      <w:r>
+        <w:t>trusted by Enhanced Safe Browsing. This is normal for newly-approved</w:t>
+      </w:r>
+    </w:p>
+    <w:p>
+      <w:r>
+        <w:t>extensions and means only that the extension has not yet accumulated</w:t>
+      </w:r>
+    </w:p>
+    <w:p>
+      <w:r>
+        <w:t>install history — it is not a security concern. Click **Continue to</w:t>
+      </w:r>
+    </w:p>
+    <w:p>
+      <w:r>
+        <w:t>install**.</w:t>
+      </w:r>
+    </w:p>
+    <w:p>
+      <w:r>
+        <w:t>Chrome will then show a second dialog asking you to confirm two</w:t>
+      </w:r>
+    </w:p>
+    <w:p>
+      <w:r>
+        <w:t xml:space="preserve">permissions. Click </w:t>
+      </w:r>
+      <w:r>
+        <w:rPr>
+          <w:b/>
+        </w:rPr>
+        <w:t>Add extension</w:t>
+      </w:r>
+      <w:r>
+        <w:t xml:space="preserve"> to complete the installation. The</w:t>
+      </w:r>
+    </w:p>
+    <w:p>
+      <w:r>
+        <w:t>AMASAMYA toolbar icon will appear in Chrome's top-right area.</w:t>
       </w:r>
     </w:p>
     <w:p>

</xml_diff>